<commit_message>
tweaking the build system
</commit_message>
<xml_diff>
--- a/docs/readme.docx
+++ b/docs/readme.docx
@@ -105,15 +105,15 @@
           <w:sz w:val="24"/>
           <w:szCs w:val="24"/>
         </w:rPr>
-        <w:t>January 1</w:t>
-      </w:r>
-      <w:r>
-        <w:rPr>
-          <w:rFonts w:ascii="Calibri" w:hAnsi="Calibri" w:cs="Arial"/>
-          <w:sz w:val="24"/>
-          <w:szCs w:val="24"/>
-        </w:rPr>
-        <w:t>9</w:t>
+        <w:t xml:space="preserve">January </w:t>
+      </w:r>
+      <w:r>
+        <w:rPr>
+          <w:rFonts w:ascii="Calibri" w:hAnsi="Calibri" w:cs="Arial"/>
+          <w:sz w:val="24"/>
+          <w:szCs w:val="24"/>
+        </w:rPr>
+        <w:t>20</w:t>
       </w:r>
       <w:r>
         <w:rPr>
@@ -151,8 +151,6 @@
           <w:szCs w:val="24"/>
         </w:rPr>
       </w:pPr>
-      <w:bookmarkStart w:id="0" w:name="_GoBack"/>
-      <w:bookmarkEnd w:id="0"/>
     </w:p>
     <w:p>
       <w:pPr>
@@ -332,7 +330,18 @@
           <w:sz w:val="24"/>
           <w:szCs w:val="24"/>
         </w:rPr>
-        <w:t>Highlights of this release include the following:</w:t>
+        <w:t>Highlights of this relea</w:t>
+      </w:r>
+      <w:bookmarkStart w:id="0" w:name="_GoBack"/>
+      <w:bookmarkEnd w:id="0"/>
+      <w:r>
+        <w:rPr>
+          <w:rFonts w:ascii="Calibri" w:hAnsi="Calibri" w:cs="Arial"/>
+          <w:iCs/>
+          <w:sz w:val="24"/>
+          <w:szCs w:val="24"/>
+        </w:rPr>
+        <w:t>se include the following:</w:t>
       </w:r>
     </w:p>
     <w:p>
@@ -375,7 +384,7 @@
           <w:sz w:val="24"/>
           <w:szCs w:val="24"/>
         </w:rPr>
-        <w:t xml:space="preserve">Installers for </w:t>
+        <w:t xml:space="preserve">Finally, </w:t>
       </w:r>
       <w:r>
         <w:rPr>
@@ -384,6 +393,33 @@
           <w:sz w:val="24"/>
           <w:szCs w:val="24"/>
         </w:rPr>
+        <w:t xml:space="preserve">added </w:t>
+      </w:r>
+      <w:r>
+        <w:rPr>
+          <w:rFonts w:ascii="Calibri" w:hAnsi="Calibri" w:cs="Arial"/>
+          <w:iCs/>
+          <w:sz w:val="24"/>
+          <w:szCs w:val="24"/>
+        </w:rPr>
+        <w:t>i</w:t>
+      </w:r>
+      <w:r>
+        <w:rPr>
+          <w:rFonts w:ascii="Calibri" w:hAnsi="Calibri" w:cs="Arial"/>
+          <w:iCs/>
+          <w:sz w:val="24"/>
+          <w:szCs w:val="24"/>
+        </w:rPr>
+        <w:t xml:space="preserve">nstallers for </w:t>
+      </w:r>
+      <w:r>
+        <w:rPr>
+          <w:rFonts w:ascii="Calibri" w:hAnsi="Calibri" w:cs="Arial"/>
+          <w:iCs/>
+          <w:sz w:val="24"/>
+          <w:szCs w:val="24"/>
+        </w:rPr>
         <w:t xml:space="preserve">Ubuntu and </w:t>
       </w:r>
       <w:proofErr w:type="spellStart"/>
@@ -413,7 +449,7 @@
           <w:sz w:val="24"/>
           <w:szCs w:val="24"/>
         </w:rPr>
-        <w:t xml:space="preserve"> </w:t>
+        <w:t xml:space="preserve"> overhauling the build system</w:t>
       </w:r>
       <w:r>
         <w:rPr>
@@ -475,7 +511,43 @@
           <w:sz w:val="24"/>
           <w:szCs w:val="24"/>
         </w:rPr>
-        <w:t xml:space="preserve">Optimized stack operation for floats </w:t>
+        <w:t>Optimized stack operation</w:t>
+      </w:r>
+      <w:r>
+        <w:rPr>
+          <w:rFonts w:ascii="Calibri" w:hAnsi="Calibri" w:cs="Arial"/>
+          <w:iCs/>
+          <w:sz w:val="24"/>
+          <w:szCs w:val="24"/>
+        </w:rPr>
+        <w:t>s</w:t>
+      </w:r>
+      <w:r>
+        <w:rPr>
+          <w:rFonts w:ascii="Calibri" w:hAnsi="Calibri" w:cs="Arial"/>
+          <w:iCs/>
+          <w:sz w:val="24"/>
+          <w:szCs w:val="24"/>
+        </w:rPr>
+        <w:t xml:space="preserve"> for </w:t>
+      </w:r>
+      <w:r>
+        <w:rPr>
+          <w:rFonts w:ascii="Calibri" w:hAnsi="Calibri" w:cs="Arial"/>
+          <w:iCs/>
+          <w:sz w:val="24"/>
+          <w:szCs w:val="24"/>
+        </w:rPr>
+        <w:t>floating point operations</w:t>
+      </w:r>
+      <w:r>
+        <w:rPr>
+          <w:rFonts w:ascii="Calibri" w:hAnsi="Calibri" w:cs="Arial"/>
+          <w:iCs/>
+          <w:sz w:val="24"/>
+          <w:szCs w:val="24"/>
+        </w:rPr>
+        <w:t xml:space="preserve"> </w:t>
       </w:r>
       <w:r>
         <w:rPr>
@@ -528,7 +600,25 @@
           <w:sz w:val="24"/>
           <w:szCs w:val="24"/>
         </w:rPr>
-        <w:t xml:space="preserve">Added missing check for array assignment to array element </w:t>
+        <w:t>Added missing</w:t>
+      </w:r>
+      <w:r>
+        <w:rPr>
+          <w:rFonts w:ascii="Calibri" w:hAnsi="Calibri" w:cs="Arial"/>
+          <w:iCs/>
+          <w:sz w:val="24"/>
+          <w:szCs w:val="24"/>
+        </w:rPr>
+        <w:t xml:space="preserve"> compiler</w:t>
+      </w:r>
+      <w:r>
+        <w:rPr>
+          <w:rFonts w:ascii="Calibri" w:hAnsi="Calibri" w:cs="Arial"/>
+          <w:iCs/>
+          <w:sz w:val="24"/>
+          <w:szCs w:val="24"/>
+        </w:rPr>
+        <w:t xml:space="preserve"> check for array assignment to array element </w:t>
       </w:r>
       <w:r>
         <w:rPr>
@@ -1906,7 +1996,6 @@
           <w:sz w:val="24"/>
           <w:szCs w:val="24"/>
         </w:rPr>
-        <w:lastRenderedPageBreak/>
         <w:t>Compile/execute for code that has library dependencies:</w:t>
       </w:r>
     </w:p>

</xml_diff>